<commit_message>
move configuration stuff to data/config.py
</commit_message>
<xml_diff>
--- a/autocana/templates/invoice.docx
+++ b/autocana/templates/invoice.docx
@@ -820,7 +820,14 @@
           <w:rtl w:val="0"/>
         </w:rPr>
         <w:tab/>
-        <w:t xml:space="preserve"> Contract Number: FL1481ISD</w:t>
+        <w:t xml:space="preserve"> Contract Number: </w:t>
+      </w:r>
+      <w:r>
+        <w:rPr>
+          <w:rtl w:val="0"/>
+          <w:lang w:val="en-US"/>
+        </w:rPr>
+        <w:t xml:space="preserve">{{ contract_number }}</w:t>
       </w:r>
       <w:r/>
     </w:p>
@@ -829,16 +836,38 @@
         <w:pBdr/>
         <w:spacing/>
         <w:ind w:firstLine="0" w:left="0"/>
-        <w:rPr/>
+        <w:rPr>
+          <w:lang w:val="en-US"/>
+        </w:rPr>
       </w:pPr>
       <w:r>
         <w:rPr>
           <w:rtl w:val="0"/>
         </w:rPr>
         <w:tab/>
-        <w:t xml:space="preserve"> SC: FC: 7949 – SC 662</w:t>
+        <w:t xml:space="preserve"> SC: </w:t>
+      </w:r>
+      <w:r>
+        <w:rPr>
+          <w:rtl w:val="0"/>
+          <w:lang w:val="en-US"/>
+        </w:rPr>
+        <w:t xml:space="preserve">{{ dev_contract</w:t>
+      </w:r>
+      <w:r>
+        <w:rPr>
+          <w:rtl w:val="0"/>
+          <w:lang w:val="en-US"/>
+        </w:rPr>
+        <w:t xml:space="preserve"> }}</w:t>
       </w:r>
       <w:r/>
+      <w:r/>
+      <w:r>
+        <w:rPr>
+          <w:lang w:val="en-US"/>
+        </w:rPr>
+      </w:r>
     </w:p>
     <w:p>
       <w:pPr>
@@ -3102,6 +3131,7 @@
         <w:rPr>
           <w:rFonts w:ascii="Calibri" w:hAnsi="Calibri" w:eastAsia="Calibri" w:cs="Calibri"/>
           <w:b w:val="0"/>
+          <w:bCs w:val="0"/>
           <w:i w:val="0"/>
           <w:smallCaps w:val="0"/>
           <w:strike w:val="0"/>
@@ -3111,6 +3141,7 @@
           <w:u w:val="none"/>
           <w:shd w:val="clear" w:color="auto" w:fill="auto"/>
           <w:vertAlign w:val="baseline"/>
+          <w:lang w:val="en-US"/>
         </w:rPr>
       </w:r>
       <w:r>
@@ -3211,6 +3242,21 @@
           <w:vertAlign w:val="baseline"/>
         </w:rPr>
       </w:r>
+      <w:r>
+        <w:rPr>
+          <w:rFonts w:ascii="Calibri" w:hAnsi="Calibri" w:eastAsia="Calibri" w:cs="Calibri"/>
+          <w:b w:val="0"/>
+          <w:bCs w:val="0"/>
+          <w:i w:val="0"/>
+          <w:smallCaps w:val="0"/>
+          <w:strike w:val="0"/>
+          <w:color w:val="000000"/>
+          <w:sz w:val="22"/>
+          <w:szCs w:val="22"/>
+          <w:u w:val="none"/>
+          <w:vertAlign w:val="baseline"/>
+        </w:rPr>
+      </w:r>
     </w:p>
     <w:p>
       <w:pPr>
@@ -3287,6 +3333,11 @@
           <w:lang w:val="en-US"/>
         </w:rPr>
         <w:t xml:space="preserve">{{ email }}</w:t>
+      </w:r>
+      <w:r>
+        <w:rPr>
+          <w:highlight w:val="none"/>
+        </w:rPr>
       </w:r>
       <w:r>
         <w:rPr>

</xml_diff>